<commit_message>
updated calibration hands, updated doc, updated scripts -- added requirements too e.g. python 3.8.20
</commit_message>
<xml_diff>
--- a/Calibration Of Hand Tracking.docx
+++ b/Calibration Of Hand Tracking.docx
@@ -1,13 +1,33 @@
 
 <file path=word/document.xml><?xml version="1.0" encoding="utf-8"?>
-<w:document xmlns:wpc="http://schemas.microsoft.com/office/word/2010/wordprocessingCanvas" xmlns:cx="http://schemas.microsoft.com/office/drawing/2014/chartex" xmlns:cx1="http://schemas.microsoft.com/office/drawing/2015/9/8/chartex" xmlns:cx2="http://schemas.microsoft.com/office/drawing/2015/10/21/chartex" xmlns:cx3="http://schemas.microsoft.com/office/drawing/2016/5/9/chartex" xmlns:cx4="http://schemas.microsoft.com/office/drawing/2016/5/10/chartex" xmlns:cx5="http://schemas.microsoft.com/office/drawing/2016/5/11/chartex" xmlns:cx6="http://schemas.microsoft.com/office/drawing/2016/5/12/chartex" xmlns:cx7="http://schemas.microsoft.com/office/drawing/2016/5/13/chartex" xmlns:cx8="http://schemas.microsoft.com/office/drawing/2016/5/14/chartex" xmlns:mc="http://schemas.openxmlformats.org/markup-compatibility/2006" xmlns:aink="http://schemas.microsoft.com/office/drawing/2016/ink" xmlns:am3d="http://schemas.microsoft.com/office/drawing/2017/model3d" xmlns:o="urn:schemas-microsoft-com:office:office" xmlns:r="http://schemas.openxmlformats.org/officeDocument/2006/relationships" xmlns:m="http://schemas.openxmlformats.org/officeDocument/2006/math" xmlns:v="urn:schemas-microsoft-com:vml" xmlns:wp14="http://schemas.microsoft.com/office/word/2010/wordprocessingDrawing" xmlns:wp="http://schemas.openxmlformats.org/drawingml/2006/wordprocessingDrawing" xmlns:w10="urn:schemas-microsoft-com:office:word" xmlns:w="http://schemas.openxmlformats.org/wordprocessingml/2006/main" xmlns:w14="http://schemas.microsoft.com/office/word/2010/wordml" xmlns:w15="http://schemas.microsoft.com/office/word/2012/wordml" xmlns:w16cid="http://schemas.microsoft.com/office/word/2016/wordml/cid" xmlns:w16se="http://schemas.microsoft.com/office/word/2015/wordml/symex" xmlns:wpg="http://schemas.microsoft.com/office/word/2010/wordprocessingGroup" xmlns:wpi="http://schemas.microsoft.com/office/word/2010/wordprocessingInk" xmlns:wne="http://schemas.microsoft.com/office/word/2006/wordml" xmlns:wps="http://schemas.microsoft.com/office/word/2010/wordprocessingShape" mc:Ignorable="w14 w15 w16se w16cid wp14">
+<w:document xmlns:wpc="http://schemas.microsoft.com/office/word/2010/wordprocessingCanvas" xmlns:cx="http://schemas.microsoft.com/office/drawing/2014/chartex" xmlns:cx1="http://schemas.microsoft.com/office/drawing/2015/9/8/chartex" xmlns:cx2="http://schemas.microsoft.com/office/drawing/2015/10/21/chartex" xmlns:cx3="http://schemas.microsoft.com/office/drawing/2016/5/9/chartex" xmlns:cx4="http://schemas.microsoft.com/office/drawing/2016/5/10/chartex" xmlns:cx5="http://schemas.microsoft.com/office/drawing/2016/5/11/chartex" xmlns:cx6="http://schemas.microsoft.com/office/drawing/2016/5/12/chartex" xmlns:cx7="http://schemas.microsoft.com/office/drawing/2016/5/13/chartex" xmlns:cx8="http://schemas.microsoft.com/office/drawing/2016/5/14/chartex" xmlns:mc="http://schemas.openxmlformats.org/markup-compatibility/2006" xmlns:aink="http://schemas.microsoft.com/office/drawing/2016/ink" xmlns:am3d="http://schemas.microsoft.com/office/drawing/2017/model3d" xmlns:o="urn:schemas-microsoft-com:office:office" xmlns:r="http://schemas.openxmlformats.org/officeDocument/2006/relationships" xmlns:m="http://schemas.openxmlformats.org/officeDocument/2006/math" xmlns:v="urn:schemas-microsoft-com:vml" xmlns:wp14="http://schemas.microsoft.com/office/word/2010/wordprocessingDrawing" xmlns:wp="http://schemas.openxmlformats.org/drawingml/2006/wordprocessingDrawing" xmlns:w10="urn:schemas-microsoft-com:office:word" xmlns:w="http://schemas.openxmlformats.org/wordprocessingml/2006/main" xmlns:w14="http://schemas.microsoft.com/office/word/2010/wordml" xmlns:w15="http://schemas.microsoft.com/office/word/2012/wordml" xmlns:w16cex="http://schemas.microsoft.com/office/word/2018/wordml/cex" xmlns:w16cid="http://schemas.microsoft.com/office/word/2016/wordml/cid" xmlns:w16="http://schemas.microsoft.com/office/word/2018/wordml" xmlns:w16sdtdh="http://schemas.microsoft.com/office/word/2020/wordml/sdtdatahash" xmlns:w16se="http://schemas.microsoft.com/office/word/2015/wordml/symex" xmlns:wpg="http://schemas.microsoft.com/office/word/2010/wordprocessingGroup" xmlns:wpi="http://schemas.microsoft.com/office/word/2010/wordprocessingInk" xmlns:wne="http://schemas.microsoft.com/office/word/2006/wordml" xmlns:wps="http://schemas.microsoft.com/office/word/2010/wordprocessingShape" mc:Ignorable="w14 w15 w16se w16cid w16 w16cex w16sdtdh wp14">
   <w:body>
     <w:p>
-      <w:r>
-        <w:t>INSTRUCTIONS TO CALIBRATE HANDTRACKING</w:t>
-      </w:r>
-    </w:p>
-    <w:p/>
+      <w:pPr>
+        <w:rPr>
+          <w:lang w:val="en-US"/>
+        </w:rPr>
+      </w:pPr>
+      <w:r>
+        <w:rPr>
+          <w:lang w:val="en-US"/>
+        </w:rPr>
+        <w:t>Instructions to Calibrate Cameras a</w:t>
+      </w:r>
+      <w:r>
+        <w:rPr>
+          <w:lang w:val="en-US"/>
+        </w:rPr>
+        <w:t>nd Hand tracking</w:t>
+      </w:r>
+    </w:p>
+    <w:p>
+      <w:pPr>
+        <w:rPr>
+          <w:lang w:val="en-US"/>
+        </w:rPr>
+      </w:pPr>
+    </w:p>
     <w:p>
       <w:pPr>
         <w:pStyle w:val="Prrafodelista"/>
@@ -29,110 +49,214 @@
         <w:rPr>
           <w:lang w:val="en-GB"/>
         </w:rPr>
-        <w:t>nsole inside “</w:t>
-      </w:r>
-      <w:proofErr w:type="spellStart"/>
-      <w:r>
-        <w:rPr>
-          <w:lang w:val="en-GB"/>
-        </w:rPr>
-        <w:t>python_stereo_camera</w:t>
-      </w:r>
-      <w:bookmarkStart w:id="0" w:name="_GoBack"/>
-      <w:bookmarkEnd w:id="0"/>
-      <w:r>
-        <w:rPr>
-          <w:lang w:val="en-GB"/>
-        </w:rPr>
-        <w:t>_calibrate</w:t>
-      </w:r>
-      <w:proofErr w:type="spellEnd"/>
-      <w:r>
-        <w:rPr>
-          <w:lang w:val="en-GB"/>
-        </w:rPr>
-        <w:t>-main”</w:t>
-      </w:r>
-    </w:p>
-    <w:p>
-      <w:pPr>
-        <w:pStyle w:val="Prrafodelista"/>
-        <w:numPr>
-          <w:ilvl w:val="0"/>
-          <w:numId w:val="2"/>
-        </w:numPr>
-        <w:rPr>
-          <w:lang w:val="en-GB"/>
-        </w:rPr>
-      </w:pPr>
-      <w:r>
-        <w:rPr>
-          <w:lang w:val="en-GB"/>
-        </w:rPr>
-        <w:t xml:space="preserve">On </w:t>
-      </w:r>
-      <w:proofErr w:type="spellStart"/>
-      <w:r>
-        <w:rPr>
-          <w:lang w:val="en-GB"/>
-        </w:rPr>
-        <w:t>calibration_</w:t>
-      </w:r>
-      <w:proofErr w:type="gramStart"/>
-      <w:r>
-        <w:rPr>
-          <w:lang w:val="en-GB"/>
-        </w:rPr>
-        <w:t>settings.yaml</w:t>
-      </w:r>
-      <w:proofErr w:type="spellEnd"/>
-      <w:proofErr w:type="gramEnd"/>
-      <w:r>
-        <w:rPr>
-          <w:lang w:val="en-GB"/>
-        </w:rPr>
-        <w:t xml:space="preserve"> modify the options to fit the number of the cameras, the resolution and the specifications of the physical chessboard</w:t>
-      </w:r>
-    </w:p>
-    <w:p>
-      <w:pPr>
-        <w:pStyle w:val="Prrafodelista"/>
-        <w:numPr>
-          <w:ilvl w:val="0"/>
-          <w:numId w:val="2"/>
-        </w:numPr>
-        <w:rPr>
-          <w:lang w:val="en-GB"/>
-        </w:rPr>
-      </w:pPr>
-      <w:r>
-        <w:rPr>
-          <w:lang w:val="en-GB"/>
-        </w:rPr>
-        <w:t>Write “</w:t>
-      </w:r>
-      <w:proofErr w:type="gramStart"/>
-      <w:r>
-        <w:rPr>
-          <w:lang w:val="en-GB"/>
-        </w:rPr>
-        <w:t>python .</w:t>
-      </w:r>
-      <w:proofErr w:type="gramEnd"/>
-      <w:r>
-        <w:rPr>
-          <w:lang w:val="en-GB"/>
-        </w:rPr>
-        <w:t>\calib.py .\</w:t>
-      </w:r>
-      <w:proofErr w:type="spellStart"/>
-      <w:r>
-        <w:rPr>
-          <w:lang w:val="en-GB"/>
-        </w:rPr>
-        <w:t>calibration_settings</w:t>
-      </w:r>
-      <w:proofErr w:type="spellEnd"/>
+        <w:t>nsole</w:t>
+      </w:r>
+      <w:r>
+        <w:rPr>
+          <w:lang w:val="en-GB"/>
+        </w:rPr>
+        <w:t xml:space="preserve"> inside HandTracking</w:t>
+      </w:r>
+    </w:p>
+    <w:p>
+      <w:pPr>
+        <w:pStyle w:val="Prrafodelista"/>
+        <w:numPr>
+          <w:ilvl w:val="0"/>
+          <w:numId w:val="2"/>
+        </w:numPr>
+        <w:rPr>
+          <w:lang w:val="en-GB"/>
+        </w:rPr>
+      </w:pPr>
+      <w:r>
+        <w:rPr>
+          <w:lang w:val="en-GB"/>
+        </w:rPr>
+        <w:t>In “</w:t>
+      </w:r>
+      <w:r>
+        <w:rPr>
+          <w:lang w:val="en-GB"/>
+        </w:rPr>
+        <w:t>calibrationCameras_settings</w:t>
+      </w:r>
+      <w:r>
+        <w:rPr>
+          <w:lang w:val="en-GB"/>
+        </w:rPr>
+        <w:t>.yaml”: modify the parameters for calibrating the two cameras.</w:t>
+      </w:r>
+    </w:p>
+    <w:p>
+      <w:pPr>
+        <w:pStyle w:val="Prrafodelista"/>
+        <w:numPr>
+          <w:ilvl w:val="1"/>
+          <w:numId w:val="2"/>
+        </w:numPr>
+        <w:rPr>
+          <w:lang w:val="en-GB"/>
+        </w:rPr>
+      </w:pPr>
+      <w:r>
+        <w:rPr>
+          <w:lang w:val="en-GB"/>
+        </w:rPr>
+        <w:t>IDs of cameras</w:t>
+      </w:r>
+    </w:p>
+    <w:p>
+      <w:pPr>
+        <w:pStyle w:val="Prrafodelista"/>
+        <w:numPr>
+          <w:ilvl w:val="1"/>
+          <w:numId w:val="2"/>
+        </w:numPr>
+        <w:rPr>
+          <w:lang w:val="en-GB"/>
+        </w:rPr>
+      </w:pPr>
+      <w:r>
+        <w:rPr>
+          <w:lang w:val="en-GB"/>
+        </w:rPr>
+        <w:t>Frame width and height (we want 1920 x 1080 with our webcams)</w:t>
+      </w:r>
+    </w:p>
+    <w:p>
+      <w:pPr>
+        <w:pStyle w:val="Prrafodelista"/>
+        <w:numPr>
+          <w:ilvl w:val="1"/>
+          <w:numId w:val="2"/>
+        </w:numPr>
+        <w:rPr>
+          <w:lang w:val="en-GB"/>
+        </w:rPr>
+      </w:pPr>
+      <w:r>
+        <w:rPr>
+          <w:lang w:val="en-GB"/>
+        </w:rPr>
+        <w:t>Number of frames to capture for calibration (10 is ok)</w:t>
+      </w:r>
+    </w:p>
+    <w:p>
+      <w:pPr>
+        <w:pStyle w:val="Prrafodelista"/>
+        <w:numPr>
+          <w:ilvl w:val="1"/>
+          <w:numId w:val="2"/>
+        </w:numPr>
+        <w:rPr>
+          <w:lang w:val="en-GB"/>
+        </w:rPr>
+      </w:pPr>
+      <w:r>
+        <w:rPr>
+          <w:lang w:val="en-GB"/>
+        </w:rPr>
+        <w:t>Size of checkboard square (not mandatory)</w:t>
+      </w:r>
+    </w:p>
+    <w:p>
+      <w:pPr>
+        <w:pStyle w:val="Prrafodelista"/>
+        <w:numPr>
+          <w:ilvl w:val="1"/>
+          <w:numId w:val="2"/>
+        </w:numPr>
+        <w:rPr>
+          <w:lang w:val="en-GB"/>
+        </w:rPr>
+      </w:pPr>
+      <w:r>
+        <w:rPr>
+          <w:lang w:val="en-GB"/>
+        </w:rPr>
+        <w:t xml:space="preserve">Checkboard rows and columns: </w:t>
+      </w:r>
+      <w:r>
+        <w:rPr>
+          <w:b/>
+          <w:bCs/>
+          <w:lang w:val="en-GB"/>
+        </w:rPr>
+        <w:t>CAREFUL</w:t>
+      </w:r>
+      <w:r>
+        <w:rPr>
+          <w:lang w:val="en-GB"/>
+        </w:rPr>
+        <w:t>, if your checkboard is 7x10 you need to write 6x9 -&gt; it’s the length – 1</w:t>
+      </w:r>
+    </w:p>
+    <w:p>
+      <w:pPr>
+        <w:pStyle w:val="Prrafodelista"/>
+        <w:numPr>
+          <w:ilvl w:val="1"/>
+          <w:numId w:val="2"/>
+        </w:numPr>
+        <w:rPr>
+          <w:lang w:val="en-GB"/>
+        </w:rPr>
+      </w:pPr>
+      <w:r>
+        <w:rPr>
+          <w:lang w:val="en-GB"/>
+        </w:rPr>
+        <w:t>Cooldown: delay between frame captures</w:t>
+      </w:r>
+    </w:p>
+    <w:p>
+      <w:pPr>
+        <w:pStyle w:val="Prrafodelista"/>
+        <w:numPr>
+          <w:ilvl w:val="0"/>
+          <w:numId w:val="2"/>
+        </w:numPr>
+        <w:rPr>
+          <w:lang w:val="en-GB"/>
+        </w:rPr>
+      </w:pPr>
+      <w:r>
+        <w:rPr>
+          <w:lang w:val="en-GB"/>
+        </w:rPr>
+        <w:t>Write “python .\calib</w:t>
+      </w:r>
+      <w:r>
+        <w:rPr>
+          <w:lang w:val="en-GB"/>
+        </w:rPr>
+        <w:t>rationCameras</w:t>
+      </w:r>
+      <w:r>
+        <w:rPr>
+          <w:lang w:val="en-GB"/>
+        </w:rPr>
+        <w:t>.py .\calibration</w:t>
+      </w:r>
+      <w:r>
+        <w:rPr>
+          <w:lang w:val="en-GB"/>
+        </w:rPr>
+        <w:t>Cameras</w:t>
+      </w:r>
+      <w:r>
+        <w:rPr>
+          <w:lang w:val="en-GB"/>
+        </w:rPr>
+        <w:t>_settings</w:t>
+      </w:r>
+      <w:r>
+        <w:rPr>
+          <w:lang w:val="en-GB"/>
+        </w:rPr>
+        <w:t>.yaml</w:t>
+      </w:r>
       <w:r>
         <w:rPr>
           <w:lang w:val="en-GB"/>
@@ -155,141 +279,377 @@
         <w:rPr>
           <w:lang w:val="en-GB"/>
         </w:rPr>
-        <w:t xml:space="preserve">The 2 cameras should turn on, if not change the number of the cameras in </w:t>
-      </w:r>
-      <w:proofErr w:type="spellStart"/>
-      <w:r>
-        <w:rPr>
-          <w:lang w:val="en-GB"/>
-        </w:rPr>
-        <w:t>calibration_</w:t>
-      </w:r>
-      <w:proofErr w:type="gramStart"/>
-      <w:r>
-        <w:rPr>
-          <w:lang w:val="en-GB"/>
-        </w:rPr>
-        <w:t>settings.yaml</w:t>
-      </w:r>
-      <w:proofErr w:type="spellEnd"/>
-      <w:proofErr w:type="gramEnd"/>
-    </w:p>
-    <w:p>
-      <w:pPr>
-        <w:pStyle w:val="Prrafodelista"/>
-        <w:numPr>
-          <w:ilvl w:val="0"/>
-          <w:numId w:val="2"/>
-        </w:numPr>
-        <w:rPr>
-          <w:lang w:val="en-GB"/>
-        </w:rPr>
-      </w:pPr>
-      <w:r>
-        <w:rPr>
-          <w:lang w:val="en-GB"/>
-        </w:rPr>
-        <w:t>Follow the instructions for the single camera calibration. You should record the chessboard on different positions for both cameras</w:t>
-      </w:r>
-    </w:p>
-    <w:p>
-      <w:pPr>
-        <w:pStyle w:val="Prrafodelista"/>
-        <w:numPr>
-          <w:ilvl w:val="0"/>
-          <w:numId w:val="2"/>
-        </w:numPr>
-        <w:rPr>
-          <w:lang w:val="en-GB"/>
-        </w:rPr>
-      </w:pPr>
-      <w:r>
-        <w:rPr>
-          <w:lang w:val="en-GB"/>
-        </w:rPr>
-        <w:t>Check the detection results and press “space” if they are well done, if not press “s”</w:t>
-      </w:r>
-    </w:p>
-    <w:p>
-      <w:pPr>
-        <w:pStyle w:val="Prrafodelista"/>
-        <w:numPr>
-          <w:ilvl w:val="0"/>
-          <w:numId w:val="2"/>
-        </w:numPr>
-        <w:rPr>
-          <w:lang w:val="en-GB"/>
-        </w:rPr>
-      </w:pPr>
-      <w:r>
-        <w:rPr>
-          <w:lang w:val="en-GB"/>
-        </w:rPr>
-        <w:t>Now do the same calibration but placing the chessboard on a visible place for both cameras</w:t>
-      </w:r>
-    </w:p>
-    <w:p>
-      <w:pPr>
-        <w:pStyle w:val="Prrafodelista"/>
-        <w:numPr>
-          <w:ilvl w:val="0"/>
-          <w:numId w:val="2"/>
-        </w:numPr>
-        <w:rPr>
-          <w:lang w:val="en-GB"/>
-        </w:rPr>
-      </w:pPr>
-      <w:r>
-        <w:rPr>
-          <w:lang w:val="en-GB"/>
-        </w:rPr>
-        <w:t>“</w:t>
-      </w:r>
-      <w:proofErr w:type="spellStart"/>
-      <w:r>
-        <w:rPr>
-          <w:lang w:val="en-GB"/>
-        </w:rPr>
-        <w:t>camera_parameters</w:t>
-      </w:r>
-      <w:proofErr w:type="spellEnd"/>
-      <w:r>
-        <w:rPr>
-          <w:lang w:val="en-GB"/>
-        </w:rPr>
-        <w:t>” stores the camera parameters of the position of the cameras. Beware that if you move them you should repeat the previous steps</w:t>
-      </w:r>
-    </w:p>
-    <w:p>
-      <w:pPr>
-        <w:pStyle w:val="Prrafodelista"/>
-        <w:numPr>
-          <w:ilvl w:val="0"/>
-          <w:numId w:val="2"/>
-        </w:numPr>
-        <w:rPr>
-          <w:lang w:val="en-GB"/>
-        </w:rPr>
-      </w:pPr>
-      <w:r>
-        <w:rPr>
-          <w:lang w:val="en-GB"/>
-        </w:rPr>
-        <w:t xml:space="preserve">Go to “handpose3D-main -&gt; </w:t>
-      </w:r>
-      <w:proofErr w:type="spellStart"/>
-      <w:r>
-        <w:rPr>
-          <w:lang w:val="en-GB"/>
-        </w:rPr>
-        <w:t>camera_parameters</w:t>
-      </w:r>
-      <w:proofErr w:type="spellEnd"/>
-      <w:r>
-        <w:rPr>
-          <w:lang w:val="en-GB"/>
-        </w:rPr>
-        <w:t>” and store the folders of the previous step on it changing the names as it follows:</w:t>
+        <w:t xml:space="preserve">The </w:t>
+      </w:r>
+      <w:r>
+        <w:rPr>
+          <w:lang w:val="en-GB"/>
+        </w:rPr>
+        <w:t>first</w:t>
+      </w:r>
+      <w:r>
+        <w:rPr>
+          <w:lang w:val="en-GB"/>
+        </w:rPr>
+        <w:t xml:space="preserve"> camera</w:t>
+      </w:r>
+      <w:r>
+        <w:rPr>
+          <w:lang w:val="en-GB"/>
+        </w:rPr>
+        <w:t xml:space="preserve"> </w:t>
+      </w:r>
+      <w:r>
+        <w:rPr>
+          <w:lang w:val="en-GB"/>
+        </w:rPr>
+        <w:t>should turn on</w:t>
+      </w:r>
+    </w:p>
+    <w:p>
+      <w:pPr>
+        <w:pStyle w:val="Prrafodelista"/>
+        <w:numPr>
+          <w:ilvl w:val="0"/>
+          <w:numId w:val="2"/>
+        </w:numPr>
+        <w:rPr>
+          <w:lang w:val="en-GB"/>
+        </w:rPr>
+      </w:pPr>
+      <w:r>
+        <w:rPr>
+          <w:lang w:val="en-GB"/>
+        </w:rPr>
+        <w:t xml:space="preserve">Follow the instructions for the single camera calibration. </w:t>
+      </w:r>
+    </w:p>
+    <w:p>
+      <w:pPr>
+        <w:pStyle w:val="Prrafodelista"/>
+        <w:numPr>
+          <w:ilvl w:val="0"/>
+          <w:numId w:val="2"/>
+        </w:numPr>
+        <w:rPr>
+          <w:lang w:val="en-GB"/>
+        </w:rPr>
+      </w:pPr>
+      <w:r>
+        <w:rPr>
+          <w:lang w:val="en-GB"/>
+        </w:rPr>
+        <w:t xml:space="preserve">The </w:t>
+      </w:r>
+      <w:r>
+        <w:rPr>
+          <w:lang w:val="en-GB"/>
+        </w:rPr>
+        <w:t>second</w:t>
+      </w:r>
+      <w:r>
+        <w:rPr>
+          <w:lang w:val="en-GB"/>
+        </w:rPr>
+        <w:t xml:space="preserve"> camera should turn on</w:t>
+      </w:r>
+    </w:p>
+    <w:p>
+      <w:pPr>
+        <w:pStyle w:val="Prrafodelista"/>
+        <w:numPr>
+          <w:ilvl w:val="0"/>
+          <w:numId w:val="2"/>
+        </w:numPr>
+        <w:rPr>
+          <w:lang w:val="en-GB"/>
+        </w:rPr>
+      </w:pPr>
+      <w:r>
+        <w:rPr>
+          <w:lang w:val="en-GB"/>
+        </w:rPr>
+        <w:t xml:space="preserve">Follow the instructions for the single camera calibration. </w:t>
+      </w:r>
+    </w:p>
+    <w:p>
+      <w:pPr>
+        <w:pStyle w:val="Prrafodelista"/>
+        <w:numPr>
+          <w:ilvl w:val="0"/>
+          <w:numId w:val="2"/>
+        </w:numPr>
+        <w:rPr>
+          <w:lang w:val="en-GB"/>
+        </w:rPr>
+      </w:pPr>
+      <w:r>
+        <w:rPr>
+          <w:lang w:val="en-GB"/>
+        </w:rPr>
+        <w:t>Verify the frames captured for the calibration: follow the instructions (space to validate a frame, s to remove it)</w:t>
+      </w:r>
+    </w:p>
+    <w:p>
+      <w:pPr>
+        <w:pStyle w:val="Prrafodelista"/>
+        <w:numPr>
+          <w:ilvl w:val="0"/>
+          <w:numId w:val="2"/>
+        </w:numPr>
+        <w:rPr>
+          <w:lang w:val="en-GB"/>
+        </w:rPr>
+      </w:pPr>
+      <w:r>
+        <w:rPr>
+          <w:lang w:val="en-GB"/>
+        </w:rPr>
+        <w:t xml:space="preserve">The </w:t>
+      </w:r>
+      <w:r>
+        <w:rPr>
+          <w:lang w:val="en-GB"/>
+        </w:rPr>
+        <w:t>two</w:t>
+      </w:r>
+      <w:r>
+        <w:rPr>
+          <w:lang w:val="en-GB"/>
+        </w:rPr>
+        <w:t xml:space="preserve"> camera</w:t>
+      </w:r>
+      <w:r>
+        <w:rPr>
+          <w:lang w:val="en-GB"/>
+        </w:rPr>
+        <w:t>s</w:t>
+      </w:r>
+      <w:r>
+        <w:rPr>
+          <w:lang w:val="en-GB"/>
+        </w:rPr>
+        <w:t xml:space="preserve"> should turn on</w:t>
+      </w:r>
+      <w:r>
+        <w:rPr>
+          <w:lang w:val="en-GB"/>
+        </w:rPr>
+        <w:t xml:space="preserve"> simultaneously</w:t>
+      </w:r>
+    </w:p>
+    <w:p>
+      <w:pPr>
+        <w:pStyle w:val="Prrafodelista"/>
+        <w:numPr>
+          <w:ilvl w:val="0"/>
+          <w:numId w:val="2"/>
+        </w:numPr>
+        <w:rPr>
+          <w:lang w:val="en-GB"/>
+        </w:rPr>
+      </w:pPr>
+      <w:r>
+        <w:rPr>
+          <w:lang w:val="en-GB"/>
+        </w:rPr>
+        <w:t xml:space="preserve">Follow the instructions for the </w:t>
+      </w:r>
+      <w:r>
+        <w:rPr>
+          <w:lang w:val="en-GB"/>
+        </w:rPr>
+        <w:t>multiple</w:t>
+      </w:r>
+      <w:r>
+        <w:rPr>
+          <w:lang w:val="en-GB"/>
+        </w:rPr>
+        <w:t xml:space="preserve"> camera</w:t>
+      </w:r>
+      <w:r>
+        <w:rPr>
+          <w:lang w:val="en-GB"/>
+        </w:rPr>
+        <w:t>s</w:t>
+      </w:r>
+      <w:r>
+        <w:rPr>
+          <w:lang w:val="en-GB"/>
+        </w:rPr>
+        <w:t xml:space="preserve"> calibration. </w:t>
+      </w:r>
+    </w:p>
+    <w:p>
+      <w:pPr>
+        <w:pStyle w:val="Prrafodelista"/>
+        <w:numPr>
+          <w:ilvl w:val="0"/>
+          <w:numId w:val="2"/>
+        </w:numPr>
+        <w:rPr>
+          <w:lang w:val="en-GB"/>
+        </w:rPr>
+      </w:pPr>
+      <w:r>
+        <w:rPr>
+          <w:lang w:val="en-GB"/>
+        </w:rPr>
+        <w:t>Verify the frames captured for the calibration: follow the instructions (space to validate a frame, s to remove it)</w:t>
+      </w:r>
+    </w:p>
+    <w:p>
+      <w:pPr>
+        <w:pStyle w:val="Prrafodelista"/>
+        <w:numPr>
+          <w:ilvl w:val="0"/>
+          <w:numId w:val="2"/>
+        </w:numPr>
+        <w:rPr>
+          <w:lang w:val="en-GB"/>
+        </w:rPr>
+      </w:pPr>
+      <w:r>
+        <w:rPr>
+          <w:lang w:val="en-GB"/>
+        </w:rPr>
+        <w:t>When finished, the cameras will be on, showing their common 3D coordinate system. Quit using Esc.</w:t>
+      </w:r>
+    </w:p>
+    <w:p>
+      <w:pPr>
+        <w:pStyle w:val="Prrafodelista"/>
+        <w:numPr>
+          <w:ilvl w:val="0"/>
+          <w:numId w:val="2"/>
+        </w:numPr>
+        <w:rPr>
+          <w:lang w:val="en-GB"/>
+        </w:rPr>
+      </w:pPr>
+      <w:r>
+        <w:rPr>
+          <w:lang w:val="en-GB"/>
+        </w:rPr>
+        <w:t xml:space="preserve">“camera_parameters” stores the camera parameters of the position of the cameras. </w:t>
+      </w:r>
+      <w:r>
+        <w:rPr>
+          <w:b/>
+          <w:bCs/>
+          <w:lang w:val="en-GB"/>
+        </w:rPr>
+        <w:t xml:space="preserve">Note: </w:t>
+      </w:r>
+      <w:r>
+        <w:rPr>
+          <w:lang w:val="en-GB"/>
+        </w:rPr>
+        <w:t>i</w:t>
+      </w:r>
+      <w:r>
+        <w:rPr>
+          <w:lang w:val="en-GB"/>
+        </w:rPr>
+        <w:t>f you move them you should repeat the previous steps</w:t>
+      </w:r>
+    </w:p>
+    <w:p>
+      <w:pPr>
+        <w:ind w:left="360"/>
+        <w:rPr>
+          <w:lang w:val="en-GB"/>
+        </w:rPr>
+      </w:pPr>
+      <w:r>
+        <w:rPr>
+          <w:b/>
+          <w:bCs/>
+          <w:lang w:val="en-GB"/>
+        </w:rPr>
+        <w:t>The calibration of the cameras is ready to be used. Now we need to calibrate the environment for hand tracking</w:t>
+      </w:r>
+      <w:r>
+        <w:rPr>
+          <w:b/>
+          <w:bCs/>
+          <w:lang w:val="en-GB"/>
+        </w:rPr>
+        <w:t xml:space="preserve"> (changing base for digital environment)</w:t>
+      </w:r>
+      <w:r>
+        <w:rPr>
+          <w:b/>
+          <w:bCs/>
+          <w:lang w:val="en-GB"/>
+        </w:rPr>
+        <w:t>.</w:t>
+      </w:r>
+    </w:p>
+    <w:p>
+      <w:pPr>
+        <w:pStyle w:val="Prrafodelista"/>
+        <w:numPr>
+          <w:ilvl w:val="0"/>
+          <w:numId w:val="2"/>
+        </w:numPr>
+        <w:rPr>
+          <w:lang w:val="en-GB"/>
+        </w:rPr>
+      </w:pPr>
+      <w:r>
+        <w:rPr>
+          <w:lang w:val="en-GB"/>
+        </w:rPr>
+        <w:t>Open a Console</w:t>
+      </w:r>
+      <w:r>
+        <w:rPr>
+          <w:lang w:val="en-GB"/>
+        </w:rPr>
+        <w:t xml:space="preserve"> inside HandTracking</w:t>
+      </w:r>
+    </w:p>
+    <w:p>
+      <w:pPr>
+        <w:pStyle w:val="Prrafodelista"/>
+        <w:numPr>
+          <w:ilvl w:val="0"/>
+          <w:numId w:val="2"/>
+        </w:numPr>
+        <w:rPr>
+          <w:lang w:val="en-GB"/>
+        </w:rPr>
+      </w:pPr>
+      <w:r>
+        <w:rPr>
+          <w:lang w:val="en-GB"/>
+        </w:rPr>
+        <w:t>E</w:t>
+      </w:r>
+      <w:r>
+        <w:rPr>
+          <w:lang w:val="en-GB"/>
+        </w:rPr>
+        <w:t>xecute “python .\</w:t>
+      </w:r>
+      <w:r>
+        <w:rPr>
+          <w:lang w:val="en-GB"/>
+        </w:rPr>
+        <w:t>calibrationEnvironment</w:t>
+      </w:r>
+      <w:r>
+        <w:rPr>
+          <w:lang w:val="en-GB"/>
+        </w:rPr>
+        <w:t>.py A B”:</w:t>
+      </w:r>
+      <w:r>
+        <w:rPr>
+          <w:lang w:val="en-GB"/>
+        </w:rPr>
+        <w:t xml:space="preserve"> (follow same order as in the calibrationCamerasSettings.yaml)</w:t>
       </w:r>
     </w:p>
     <w:p>
@@ -307,7 +667,7 @@
         <w:rPr>
           <w:lang w:val="en-GB"/>
         </w:rPr>
-        <w:t>Camera0_intrinsics -&gt; c0</w:t>
+        <w:t>A is the number of the first camera</w:t>
       </w:r>
     </w:p>
     <w:p>
@@ -325,134 +685,6 @@
         <w:rPr>
           <w:lang w:val="en-GB"/>
         </w:rPr>
-        <w:t xml:space="preserve">Camera1_intrinsics </w:t>
-      </w:r>
-      <w:r>
-        <w:rPr>
-          <w:lang w:val="en-GB"/>
-        </w:rPr>
-        <w:t>-&gt;</w:t>
-      </w:r>
-      <w:r>
-        <w:rPr>
-          <w:lang w:val="en-GB"/>
-        </w:rPr>
-        <w:t xml:space="preserve"> c1</w:t>
-      </w:r>
-    </w:p>
-    <w:p>
-      <w:pPr>
-        <w:pStyle w:val="Prrafodelista"/>
-        <w:numPr>
-          <w:ilvl w:val="1"/>
-          <w:numId w:val="2"/>
-        </w:numPr>
-        <w:rPr>
-          <w:lang w:val="en-GB"/>
-        </w:rPr>
-      </w:pPr>
-      <w:r>
-        <w:rPr>
-          <w:lang w:val="en-GB"/>
-        </w:rPr>
-        <w:t xml:space="preserve">Camera0_rot_trans </w:t>
-      </w:r>
-      <w:r>
-        <w:rPr>
-          <w:lang w:val="en-GB"/>
-        </w:rPr>
-        <w:t>-&gt;</w:t>
-      </w:r>
-      <w:r>
-        <w:rPr>
-          <w:lang w:val="en-GB"/>
-        </w:rPr>
-        <w:t xml:space="preserve"> rot_trans_c0</w:t>
-      </w:r>
-    </w:p>
-    <w:p>
-      <w:pPr>
-        <w:pStyle w:val="Prrafodelista"/>
-        <w:numPr>
-          <w:ilvl w:val="1"/>
-          <w:numId w:val="2"/>
-        </w:numPr>
-        <w:rPr>
-          <w:lang w:val="en-GB"/>
-        </w:rPr>
-      </w:pPr>
-      <w:r>
-        <w:rPr>
-          <w:lang w:val="en-GB"/>
-        </w:rPr>
-        <w:t>Camera1_rot_trans -&gt; rot_trans_c1</w:t>
-      </w:r>
-    </w:p>
-    <w:p>
-      <w:pPr>
-        <w:pStyle w:val="Prrafodelista"/>
-        <w:numPr>
-          <w:ilvl w:val="0"/>
-          <w:numId w:val="2"/>
-        </w:numPr>
-        <w:rPr>
-          <w:lang w:val="en-GB"/>
-        </w:rPr>
-      </w:pPr>
-      <w:r>
-        <w:rPr>
-          <w:lang w:val="en-GB"/>
-        </w:rPr>
-        <w:t>Open a Console inside handpose3D-main and execute “</w:t>
-      </w:r>
-      <w:proofErr w:type="gramStart"/>
-      <w:r>
-        <w:rPr>
-          <w:lang w:val="en-GB"/>
-        </w:rPr>
-        <w:t>python .</w:t>
-      </w:r>
-      <w:proofErr w:type="gramEnd"/>
-      <w:r>
-        <w:rPr>
-          <w:lang w:val="en-GB"/>
-        </w:rPr>
-        <w:t>\handpose3D.py A B”:</w:t>
-      </w:r>
-    </w:p>
-    <w:p>
-      <w:pPr>
-        <w:pStyle w:val="Prrafodelista"/>
-        <w:numPr>
-          <w:ilvl w:val="1"/>
-          <w:numId w:val="2"/>
-        </w:numPr>
-        <w:rPr>
-          <w:lang w:val="en-GB"/>
-        </w:rPr>
-      </w:pPr>
-      <w:r>
-        <w:rPr>
-          <w:lang w:val="en-GB"/>
-        </w:rPr>
-        <w:t>A is the number of the first camera</w:t>
-      </w:r>
-    </w:p>
-    <w:p>
-      <w:pPr>
-        <w:pStyle w:val="Prrafodelista"/>
-        <w:numPr>
-          <w:ilvl w:val="1"/>
-          <w:numId w:val="2"/>
-        </w:numPr>
-        <w:rPr>
-          <w:lang w:val="en-GB"/>
-        </w:rPr>
-      </w:pPr>
-      <w:r>
-        <w:rPr>
-          <w:lang w:val="en-GB"/>
-        </w:rPr>
         <w:t>B is the number of the second camera</w:t>
       </w:r>
     </w:p>
@@ -471,64 +703,769 @@
         <w:rPr>
           <w:lang w:val="en-GB"/>
         </w:rPr>
-        <w:t xml:space="preserve">Turn on the </w:t>
-      </w:r>
-      <w:proofErr w:type="spellStart"/>
-      <w:r>
-        <w:rPr>
-          <w:lang w:val="en-GB"/>
-        </w:rPr>
-        <w:t>Voxon</w:t>
-      </w:r>
-      <w:proofErr w:type="spellEnd"/>
-      <w:r>
-        <w:rPr>
-          <w:lang w:val="en-GB"/>
-        </w:rPr>
-        <w:t xml:space="preserve"> and open the </w:t>
-      </w:r>
-      <w:r>
-        <w:rPr>
-          <w:lang w:val="en-GB"/>
-        </w:rPr>
-        <w:t>desired App</w:t>
-      </w:r>
-    </w:p>
-    <w:p>
-      <w:pPr>
-        <w:pStyle w:val="Prrafodelista"/>
-        <w:numPr>
-          <w:ilvl w:val="0"/>
-          <w:numId w:val="2"/>
-        </w:numPr>
-        <w:rPr>
-          <w:lang w:val="en-GB"/>
-        </w:rPr>
-      </w:pPr>
-      <w:r>
-        <w:rPr>
-          <w:lang w:val="en-GB"/>
-        </w:rPr>
-        <w:t>Place your finger over each of the corners of the display area, barely touching the uppermost part, press “space” all the corners going on a counter-clockwise direction</w:t>
-      </w:r>
-    </w:p>
-    <w:p>
-      <w:pPr>
-        <w:pStyle w:val="Prrafodelista"/>
-        <w:numPr>
-          <w:ilvl w:val="0"/>
-          <w:numId w:val="2"/>
-        </w:numPr>
-        <w:rPr>
-          <w:lang w:val="en-GB"/>
-        </w:rPr>
-      </w:pPr>
-      <w:r>
-        <w:rPr>
-          <w:lang w:val="en-GB"/>
-        </w:rPr>
-        <w:t>Now you should be able to synchronize your fingers position with the scene</w:t>
-      </w:r>
+        <w:t>We will now draw a coordinate system, first (0,0), then (</w:t>
+      </w:r>
+      <w:r>
+        <w:rPr>
+          <w:lang w:val="en-GB"/>
+        </w:rPr>
+        <w:t>1</w:t>
+      </w:r>
+      <w:r>
+        <w:rPr>
+          <w:lang w:val="en-GB"/>
+        </w:rPr>
+        <w:t>,</w:t>
+      </w:r>
+      <w:r>
+        <w:rPr>
+          <w:lang w:val="en-GB"/>
+        </w:rPr>
+        <w:t>0</w:t>
+      </w:r>
+      <w:r>
+        <w:rPr>
+          <w:lang w:val="en-GB"/>
+        </w:rPr>
+        <w:t>), (</w:t>
+      </w:r>
+      <w:r>
+        <w:rPr>
+          <w:lang w:val="en-GB"/>
+        </w:rPr>
+        <w:t>0</w:t>
+      </w:r>
+      <w:r>
+        <w:rPr>
+          <w:lang w:val="en-GB"/>
+        </w:rPr>
+        <w:t>,</w:t>
+      </w:r>
+      <w:r>
+        <w:rPr>
+          <w:lang w:val="en-GB"/>
+        </w:rPr>
+        <w:t>1</w:t>
+      </w:r>
+      <w:r>
+        <w:rPr>
+          <w:lang w:val="en-GB"/>
+        </w:rPr>
+        <w:t>) and height.</w:t>
+      </w:r>
+    </w:p>
+    <w:p>
+      <w:pPr>
+        <w:pStyle w:val="Prrafodelista"/>
+        <w:numPr>
+          <w:ilvl w:val="0"/>
+          <w:numId w:val="2"/>
+        </w:numPr>
+        <w:rPr>
+          <w:lang w:val="en-GB"/>
+        </w:rPr>
+      </w:pPr>
+      <w:r>
+        <w:rPr>
+          <w:lang w:val="en-GB"/>
+        </w:rPr>
+        <w:t>Place your</w:t>
+      </w:r>
+      <w:r>
+        <w:rPr>
+          <w:lang w:val="en-GB"/>
+        </w:rPr>
+        <w:t xml:space="preserve"> index</w:t>
+      </w:r>
+      <w:r>
+        <w:rPr>
+          <w:lang w:val="en-GB"/>
+        </w:rPr>
+        <w:t xml:space="preserve"> finger</w:t>
+      </w:r>
+      <w:r>
+        <w:rPr>
+          <w:lang w:val="en-GB"/>
+        </w:rPr>
+        <w:t xml:space="preserve">tip </w:t>
+      </w:r>
+      <w:r>
+        <w:rPr>
+          <w:lang w:val="en-GB"/>
+        </w:rPr>
+        <w:t>at your origin in the physical world. Press space.</w:t>
+      </w:r>
+    </w:p>
+    <w:p>
+      <w:pPr>
+        <w:pStyle w:val="Prrafodelista"/>
+        <w:numPr>
+          <w:ilvl w:val="0"/>
+          <w:numId w:val="2"/>
+        </w:numPr>
+        <w:rPr>
+          <w:lang w:val="en-GB"/>
+        </w:rPr>
+      </w:pPr>
+      <w:r>
+        <w:rPr>
+          <w:lang w:val="en-GB"/>
+        </w:rPr>
+        <w:t>Place the physical coordinate system at your origin.</w:t>
+      </w:r>
+    </w:p>
+    <w:p>
+      <w:pPr>
+        <w:pStyle w:val="Prrafodelista"/>
+        <w:numPr>
+          <w:ilvl w:val="0"/>
+          <w:numId w:val="2"/>
+        </w:numPr>
+        <w:rPr>
+          <w:lang w:val="en-GB"/>
+        </w:rPr>
+      </w:pPr>
+      <w:r>
+        <w:rPr>
+          <w:lang w:val="en-GB"/>
+        </w:rPr>
+        <w:t>P</w:t>
+      </w:r>
+      <w:r>
+        <w:rPr>
+          <w:lang w:val="en-GB"/>
+        </w:rPr>
+        <w:t xml:space="preserve">lace your </w:t>
+      </w:r>
+      <w:r>
+        <w:rPr>
+          <w:lang w:val="en-GB"/>
+        </w:rPr>
+        <w:t xml:space="preserve">index fingertip </w:t>
+      </w:r>
+      <w:r>
+        <w:rPr>
+          <w:lang w:val="en-GB"/>
+        </w:rPr>
+        <w:t xml:space="preserve">at the </w:t>
+      </w:r>
+      <w:r>
+        <w:rPr>
+          <w:lang w:val="en-GB"/>
+        </w:rPr>
+        <w:t>x</w:t>
+      </w:r>
+      <w:r>
+        <w:rPr>
+          <w:lang w:val="en-GB"/>
+        </w:rPr>
+        <w:t>-axis. Press space.</w:t>
+      </w:r>
+    </w:p>
+    <w:p>
+      <w:pPr>
+        <w:pStyle w:val="Prrafodelista"/>
+        <w:numPr>
+          <w:ilvl w:val="0"/>
+          <w:numId w:val="2"/>
+        </w:numPr>
+        <w:rPr>
+          <w:lang w:val="en-GB"/>
+        </w:rPr>
+      </w:pPr>
+      <w:r>
+        <w:rPr>
+          <w:lang w:val="en-GB"/>
+        </w:rPr>
+        <w:t xml:space="preserve">Place your </w:t>
+      </w:r>
+      <w:r>
+        <w:rPr>
+          <w:lang w:val="en-GB"/>
+        </w:rPr>
+        <w:t xml:space="preserve">index fingertip </w:t>
+      </w:r>
+      <w:r>
+        <w:rPr>
+          <w:lang w:val="en-GB"/>
+        </w:rPr>
+        <w:t xml:space="preserve">at the  </w:t>
+      </w:r>
+      <w:r>
+        <w:rPr>
+          <w:lang w:val="en-GB"/>
+        </w:rPr>
+        <w:t>y</w:t>
+      </w:r>
+      <w:r>
+        <w:rPr>
+          <w:lang w:val="en-GB"/>
+        </w:rPr>
+        <w:t>-axis.  Press space.</w:t>
+      </w:r>
+    </w:p>
+    <w:p>
+      <w:pPr>
+        <w:pStyle w:val="Prrafodelista"/>
+        <w:numPr>
+          <w:ilvl w:val="0"/>
+          <w:numId w:val="2"/>
+        </w:numPr>
+        <w:rPr>
+          <w:lang w:val="en-GB"/>
+        </w:rPr>
+      </w:pPr>
+      <w:r>
+        <w:rPr>
+          <w:lang w:val="en-GB"/>
+        </w:rPr>
+        <w:t xml:space="preserve">Place your index fingertip at the  </w:t>
+      </w:r>
+      <w:r>
+        <w:rPr>
+          <w:lang w:val="en-GB"/>
+        </w:rPr>
+        <w:t>z</w:t>
+      </w:r>
+      <w:r>
+        <w:rPr>
+          <w:lang w:val="en-GB"/>
+        </w:rPr>
+        <w:t>-axis.  Press space.</w:t>
+      </w:r>
+    </w:p>
+    <w:p>
+      <w:pPr>
+        <w:pStyle w:val="Prrafodelista"/>
+        <w:numPr>
+          <w:ilvl w:val="0"/>
+          <w:numId w:val="2"/>
+        </w:numPr>
+        <w:rPr>
+          <w:lang w:val="en-GB"/>
+        </w:rPr>
+      </w:pPr>
+      <w:r>
+        <w:rPr>
+          <w:lang w:val="en-GB"/>
+        </w:rPr>
+        <w:t>Quit the python script using Esc.</w:t>
+      </w:r>
+      <w:r>
+        <w:rPr>
+          <w:u w:val="single"/>
+          <w:lang w:val="en-GB"/>
+        </w:rPr>
+        <w:t xml:space="preserve"> </w:t>
+      </w:r>
+    </w:p>
+    <w:p>
+      <w:pPr>
+        <w:ind w:left="360"/>
+        <w:rPr>
+          <w:b/>
+          <w:bCs/>
+          <w:lang w:val="en-GB"/>
+        </w:rPr>
+      </w:pPr>
+      <w:r>
+        <w:rPr>
+          <w:b/>
+          <w:bCs/>
+          <w:lang w:val="en-GB"/>
+        </w:rPr>
+        <w:t>Calibration of new 3D coordinates is done.</w:t>
+      </w:r>
+      <w:r>
+        <w:rPr>
+          <w:b/>
+          <w:bCs/>
+          <w:lang w:val="en-GB"/>
+        </w:rPr>
+        <w:t xml:space="preserve"> To use them, we now need to coordinate Unity, the ESP and this calibration.</w:t>
+      </w:r>
+    </w:p>
+    <w:p>
+      <w:pPr>
+        <w:ind w:left="360"/>
+        <w:rPr>
+          <w:b/>
+          <w:bCs/>
+          <w:u w:val="single"/>
+          <w:lang w:val="en-GB"/>
+        </w:rPr>
+      </w:pPr>
+    </w:p>
+    <w:p>
+      <w:pPr>
+        <w:pStyle w:val="Prrafodelista"/>
+        <w:numPr>
+          <w:ilvl w:val="0"/>
+          <w:numId w:val="2"/>
+        </w:numPr>
+        <w:rPr>
+          <w:lang w:val="en-GB"/>
+        </w:rPr>
+      </w:pPr>
+      <w:r>
+        <w:rPr>
+          <w:lang w:val="en-GB"/>
+        </w:rPr>
+        <w:lastRenderedPageBreak/>
+        <w:t>Connect an ESP32 to your computer. Open HandTracking/UDPServer.ino</w:t>
+      </w:r>
+    </w:p>
+    <w:p>
+      <w:pPr>
+        <w:pStyle w:val="Prrafodelista"/>
+        <w:numPr>
+          <w:ilvl w:val="0"/>
+          <w:numId w:val="2"/>
+        </w:numPr>
+        <w:rPr>
+          <w:lang w:val="en-GB"/>
+        </w:rPr>
+      </w:pPr>
+      <w:r>
+        <w:rPr>
+          <w:lang w:val="en-GB"/>
+        </w:rPr>
+        <w:t xml:space="preserve">Upload the script on your ESP. </w:t>
+      </w:r>
+      <w:r>
+        <w:rPr>
+          <w:lang w:val="en-GB"/>
+        </w:rPr>
+        <w:t>Make sure the port is the same in the ino script, the python handpose3d.py and the Unity script HandData.cs.</w:t>
+      </w:r>
+    </w:p>
+    <w:p>
+      <w:pPr>
+        <w:rPr>
+          <w:b/>
+          <w:bCs/>
+          <w:lang w:val="en-GB"/>
+        </w:rPr>
+      </w:pPr>
+      <w:r>
+        <w:rPr>
+          <w:b/>
+          <w:bCs/>
+          <w:lang w:val="en-GB"/>
+        </w:rPr>
+        <w:t>Ensure the computer with Unity and the computer tracking the hand are both connected to the same ESP with the same direction and port.</w:t>
+      </w:r>
+    </w:p>
+    <w:p>
+      <w:pPr>
+        <w:pStyle w:val="Prrafodelista"/>
+        <w:numPr>
+          <w:ilvl w:val="0"/>
+          <w:numId w:val="2"/>
+        </w:numPr>
+        <w:rPr>
+          <w:lang w:val="en-GB"/>
+        </w:rPr>
+      </w:pPr>
+      <w:r>
+        <w:rPr>
+          <w:lang w:val="en-GB"/>
+        </w:rPr>
+        <w:t>Open a Console</w:t>
+      </w:r>
+      <w:r>
+        <w:rPr>
+          <w:lang w:val="en-GB"/>
+        </w:rPr>
+        <w:t xml:space="preserve"> inside HandTracking</w:t>
+      </w:r>
+    </w:p>
+    <w:p>
+      <w:pPr>
+        <w:pStyle w:val="Prrafodelista"/>
+        <w:numPr>
+          <w:ilvl w:val="0"/>
+          <w:numId w:val="2"/>
+        </w:numPr>
+        <w:rPr>
+          <w:lang w:val="en-GB"/>
+        </w:rPr>
+      </w:pPr>
+      <w:r>
+        <w:rPr>
+          <w:lang w:val="en-GB"/>
+        </w:rPr>
+        <w:t>Execute “python .\</w:t>
+      </w:r>
+      <w:r>
+        <w:rPr>
+          <w:lang w:val="en-GB"/>
+        </w:rPr>
+        <w:t>handpose3d</w:t>
+      </w:r>
+      <w:r>
+        <w:rPr>
+          <w:lang w:val="en-GB"/>
+        </w:rPr>
+        <w:t>.py A B”: (follow same order as in the calibrationCamerasSettings.yaml)</w:t>
+      </w:r>
+    </w:p>
+    <w:p>
+      <w:pPr>
+        <w:pStyle w:val="Prrafodelista"/>
+        <w:numPr>
+          <w:ilvl w:val="0"/>
+          <w:numId w:val="2"/>
+        </w:numPr>
+        <w:rPr>
+          <w:lang w:val="en-GB"/>
+        </w:rPr>
+      </w:pPr>
+      <w:r>
+        <w:rPr>
+          <w:lang w:val="en-GB"/>
+        </w:rPr>
+        <w:t xml:space="preserve">Three vector magnitudes </w:t>
+      </w:r>
+      <w:r>
+        <w:rPr>
+          <w:lang w:val="en-GB"/>
+        </w:rPr>
+        <w:t>are</w:t>
+      </w:r>
+      <w:r>
+        <w:rPr>
+          <w:lang w:val="en-GB"/>
+        </w:rPr>
+        <w:t xml:space="preserve"> printed. Enter them in your Unity program before compiling. In HandData.cs: n</w:t>
+      </w:r>
+      <w:r>
+        <w:rPr>
+          <w:lang w:val="en-GB"/>
+        </w:rPr>
+        <w:t xml:space="preserve">ormOrigin </w:t>
+      </w:r>
+      <w:r>
+        <w:rPr>
+          <w:lang w:val="en-GB"/>
+        </w:rPr>
+        <w:t xml:space="preserve">in Inspector (e.g., normOrigin </w:t>
+      </w:r>
+      <w:r>
+        <w:rPr>
+          <w:lang w:val="en-GB"/>
+        </w:rPr>
+        <w:t>= new Vector3(</w:t>
+      </w:r>
+      <w:r>
+        <w:rPr>
+          <w:lang w:val="en-GB"/>
+        </w:rPr>
+        <w:t>5.7f</w:t>
+      </w:r>
+      <w:r>
+        <w:rPr>
+          <w:lang w:val="en-GB"/>
+        </w:rPr>
+        <w:t xml:space="preserve">, 2.24f, </w:t>
+      </w:r>
+      <w:r>
+        <w:rPr>
+          <w:lang w:val="en-GB"/>
+        </w:rPr>
+        <w:t>6.3</w:t>
+      </w:r>
+      <w:r>
+        <w:rPr>
+          <w:lang w:val="en-GB"/>
+        </w:rPr>
+        <w:t>f)</w:t>
+      </w:r>
+      <w:r>
+        <w:rPr>
+          <w:lang w:val="en-GB"/>
+        </w:rPr>
+        <w:t>).</w:t>
+      </w:r>
+    </w:p>
+    <w:p>
+      <w:pPr>
+        <w:ind w:left="360"/>
+        <w:rPr>
+          <w:b/>
+          <w:bCs/>
+          <w:lang w:val="en-GB"/>
+        </w:rPr>
+      </w:pPr>
+      <w:r>
+        <w:rPr>
+          <w:b/>
+          <w:bCs/>
+          <w:lang w:val="en-GB"/>
+        </w:rPr>
+        <w:t>The tracking of the hand will now be done</w:t>
+      </w:r>
+      <w:r>
+        <w:rPr>
+          <w:b/>
+          <w:bCs/>
+          <w:lang w:val="en-GB"/>
+        </w:rPr>
+        <w:t xml:space="preserve"> in real time, and all phalanges position sent.</w:t>
+      </w:r>
+    </w:p>
+    <w:p>
+      <w:pPr>
+        <w:pStyle w:val="Prrafodelista"/>
+        <w:numPr>
+          <w:ilvl w:val="0"/>
+          <w:numId w:val="2"/>
+        </w:numPr>
+        <w:rPr>
+          <w:lang w:val="en-GB"/>
+        </w:rPr>
+      </w:pPr>
+      <w:r>
+        <w:rPr>
+          <w:lang w:val="en-GB"/>
+        </w:rPr>
+        <w:t xml:space="preserve">In HandData.cs: update the coordinate system size you’ve used for calibration in </w:t>
+      </w:r>
+      <w:r>
+        <w:rPr>
+          <w:lang w:val="en-GB"/>
+        </w:rPr>
+        <w:t>coordPhysical</w:t>
+      </w:r>
+      <w:r>
+        <w:rPr>
+          <w:lang w:val="en-GB"/>
+        </w:rPr>
+        <w:t xml:space="preserve"> (e.g., </w:t>
+      </w:r>
+      <w:r>
+        <w:rPr>
+          <w:lang w:val="en-GB"/>
+        </w:rPr>
+        <w:t>coordPhysical = new Vector3(0.</w:t>
+      </w:r>
+      <w:r>
+        <w:rPr>
+          <w:lang w:val="en-GB"/>
+        </w:rPr>
+        <w:t>05</w:t>
+      </w:r>
+      <w:r>
+        <w:rPr>
+          <w:lang w:val="en-GB"/>
+        </w:rPr>
+        <w:t>f, 0.0</w:t>
+      </w:r>
+      <w:r>
+        <w:rPr>
+          <w:lang w:val="en-GB"/>
+        </w:rPr>
+        <w:t>5</w:t>
+      </w:r>
+      <w:r>
+        <w:rPr>
+          <w:lang w:val="en-GB"/>
+        </w:rPr>
+        <w:t>f, 0.</w:t>
+      </w:r>
+      <w:r>
+        <w:rPr>
+          <w:lang w:val="en-GB"/>
+        </w:rPr>
+        <w:t>05</w:t>
+      </w:r>
+      <w:r>
+        <w:rPr>
+          <w:lang w:val="en-GB"/>
+        </w:rPr>
+        <w:t>f</w:t>
+      </w:r>
+      <w:r>
+        <w:rPr>
+          <w:lang w:val="en-GB"/>
+        </w:rPr>
+        <w:t>)</w:t>
+      </w:r>
+      <w:r>
+        <w:rPr>
+          <w:lang w:val="en-GB"/>
+        </w:rPr>
+        <w:t>)</w:t>
+      </w:r>
+    </w:p>
+    <w:p>
+      <w:pPr>
+        <w:pStyle w:val="Prrafodelista"/>
+        <w:numPr>
+          <w:ilvl w:val="0"/>
+          <w:numId w:val="2"/>
+        </w:numPr>
+        <w:rPr>
+          <w:lang w:val="en-GB"/>
+        </w:rPr>
+      </w:pPr>
+      <w:r>
+        <w:rPr>
+          <w:lang w:val="en-GB"/>
+        </w:rPr>
+        <w:t xml:space="preserve">In HandData.cs: update </w:t>
+      </w:r>
+      <w:r>
+        <w:rPr>
+          <w:lang w:val="en-GB"/>
+        </w:rPr>
+        <w:t xml:space="preserve">your environment </w:t>
+      </w:r>
+      <w:r>
+        <w:rPr>
+          <w:lang w:val="en-GB"/>
+        </w:rPr>
+        <w:t xml:space="preserve">size </w:t>
+      </w:r>
+      <w:r>
+        <w:rPr>
+          <w:lang w:val="en-GB"/>
+        </w:rPr>
+        <w:t xml:space="preserve">in </w:t>
+      </w:r>
+      <w:r>
+        <w:rPr>
+          <w:lang w:val="en-GB"/>
+        </w:rPr>
+        <w:t>realEnv</w:t>
+      </w:r>
+      <w:r>
+        <w:rPr>
+          <w:lang w:val="en-GB"/>
+        </w:rPr>
+        <w:t xml:space="preserve"> (e.g., </w:t>
+      </w:r>
+      <w:r>
+        <w:rPr>
+          <w:lang w:val="en-GB"/>
+        </w:rPr>
+        <w:t>realEnv</w:t>
+      </w:r>
+      <w:r>
+        <w:rPr>
+          <w:lang w:val="en-GB"/>
+        </w:rPr>
+        <w:t xml:space="preserve"> </w:t>
+      </w:r>
+      <w:r>
+        <w:rPr>
+          <w:lang w:val="en-GB"/>
+        </w:rPr>
+        <w:t>= new Vector3(0.</w:t>
+      </w:r>
+      <w:r>
+        <w:rPr>
+          <w:lang w:val="en-GB"/>
+        </w:rPr>
+        <w:t>2</w:t>
+      </w:r>
+      <w:r>
+        <w:rPr>
+          <w:lang w:val="en-GB"/>
+        </w:rPr>
+        <w:t>, 0.0</w:t>
+      </w:r>
+      <w:r>
+        <w:rPr>
+          <w:lang w:val="en-GB"/>
+        </w:rPr>
+        <w:t>8</w:t>
+      </w:r>
+      <w:r>
+        <w:rPr>
+          <w:lang w:val="en-GB"/>
+        </w:rPr>
+        <w:t>f, 0.</w:t>
+      </w:r>
+      <w:r>
+        <w:rPr>
+          <w:lang w:val="en-GB"/>
+        </w:rPr>
+        <w:t>2</w:t>
+      </w:r>
+      <w:r>
+        <w:rPr>
+          <w:lang w:val="en-GB"/>
+        </w:rPr>
+        <w:t>f)</w:t>
+      </w:r>
+      <w:r>
+        <w:rPr>
+          <w:lang w:val="en-GB"/>
+        </w:rPr>
+        <w:t>)</w:t>
+      </w:r>
+      <w:r>
+        <w:rPr>
+          <w:lang w:val="en-GB"/>
+        </w:rPr>
+        <w:t xml:space="preserve"> If you want a real-life scale, this vector should be 0.1, 0.1, 0.1.</w:t>
+      </w:r>
+    </w:p>
+    <w:p>
+      <w:pPr>
+        <w:pStyle w:val="Prrafodelista"/>
+        <w:numPr>
+          <w:ilvl w:val="0"/>
+          <w:numId w:val="2"/>
+        </w:numPr>
+        <w:rPr>
+          <w:lang w:val="en-GB"/>
+        </w:rPr>
+      </w:pPr>
+      <w:r>
+        <w:rPr>
+          <w:lang w:val="en-GB"/>
+        </w:rPr>
+        <w:t>Make sure the HandPosition game object is located at the origin of your digital environment</w:t>
+      </w:r>
+      <w:r>
+        <w:rPr>
+          <w:lang w:val="en-GB"/>
+        </w:rPr>
+        <w:t xml:space="preserve"> (e.g., for the Voxon, you want to place it at half of the bottom corner of the view finder; at a height of 0 as the Voxon goes up and down). </w:t>
+      </w:r>
+      <w:r>
+        <w:rPr>
+          <w:lang w:val="en-GB"/>
+        </w:rPr>
+        <w:t>The coordinate system from HandsUpdate should be the same as the one you’re using in real life.</w:t>
+      </w:r>
+    </w:p>
+    <w:p>
+      <w:pPr>
+        <w:pStyle w:val="Prrafodelista"/>
+        <w:numPr>
+          <w:ilvl w:val="0"/>
+          <w:numId w:val="2"/>
+        </w:numPr>
+        <w:rPr>
+          <w:lang w:val="en-GB"/>
+        </w:rPr>
+      </w:pPr>
+      <w:r>
+        <w:rPr>
+          <w:lang w:val="en-GB"/>
+        </w:rPr>
+        <w:t>You can now start the game on Unity and see your hands moving. You can also compile the APK and see the hands in your compiled game.</w:t>
+      </w:r>
+    </w:p>
+    <w:p>
+      <w:pPr>
+        <w:rPr>
+          <w:lang w:val="en-GB"/>
+        </w:rPr>
+      </w:pPr>
     </w:p>
     <w:sectPr>
       <w:pgSz w:w="11906" w:h="16838"/>
@@ -541,7 +1478,7 @@
 </file>
 
 <file path=word/numbering.xml><?xml version="1.0" encoding="utf-8"?>
-<w:numbering xmlns:wpc="http://schemas.microsoft.com/office/word/2010/wordprocessingCanvas" xmlns:cx="http://schemas.microsoft.com/office/drawing/2014/chartex" xmlns:cx1="http://schemas.microsoft.com/office/drawing/2015/9/8/chartex" xmlns:cx2="http://schemas.microsoft.com/office/drawing/2015/10/21/chartex" xmlns:cx3="http://schemas.microsoft.com/office/drawing/2016/5/9/chartex" xmlns:cx4="http://schemas.microsoft.com/office/drawing/2016/5/10/chartex" xmlns:cx5="http://schemas.microsoft.com/office/drawing/2016/5/11/chartex" xmlns:cx6="http://schemas.microsoft.com/office/drawing/2016/5/12/chartex" xmlns:cx7="http://schemas.microsoft.com/office/drawing/2016/5/13/chartex" xmlns:cx8="http://schemas.microsoft.com/office/drawing/2016/5/14/chartex" xmlns:mc="http://schemas.openxmlformats.org/markup-compatibility/2006" xmlns:aink="http://schemas.microsoft.com/office/drawing/2016/ink" xmlns:am3d="http://schemas.microsoft.com/office/drawing/2017/model3d" xmlns:o="urn:schemas-microsoft-com:office:office" xmlns:r="http://schemas.openxmlformats.org/officeDocument/2006/relationships" xmlns:m="http://schemas.openxmlformats.org/officeDocument/2006/math" xmlns:v="urn:schemas-microsoft-com:vml" xmlns:wp14="http://schemas.microsoft.com/office/word/2010/wordprocessingDrawing" xmlns:wp="http://schemas.openxmlformats.org/drawingml/2006/wordprocessingDrawing" xmlns:w10="urn:schemas-microsoft-com:office:word" xmlns:w="http://schemas.openxmlformats.org/wordprocessingml/2006/main" xmlns:w14="http://schemas.microsoft.com/office/word/2010/wordml" xmlns:w15="http://schemas.microsoft.com/office/word/2012/wordml" xmlns:w16cid="http://schemas.microsoft.com/office/word/2016/wordml/cid" xmlns:w16se="http://schemas.microsoft.com/office/word/2015/wordml/symex" xmlns:wpg="http://schemas.microsoft.com/office/word/2010/wordprocessingGroup" xmlns:wpi="http://schemas.microsoft.com/office/word/2010/wordprocessingInk" xmlns:wne="http://schemas.microsoft.com/office/word/2006/wordml" xmlns:wps="http://schemas.microsoft.com/office/word/2010/wordprocessingShape" mc:Ignorable="w14 w15 w16se w16cid wp14">
+<w:numbering xmlns:wpc="http://schemas.microsoft.com/office/word/2010/wordprocessingCanvas" xmlns:cx="http://schemas.microsoft.com/office/drawing/2014/chartex" xmlns:cx1="http://schemas.microsoft.com/office/drawing/2015/9/8/chartex" xmlns:cx2="http://schemas.microsoft.com/office/drawing/2015/10/21/chartex" xmlns:cx3="http://schemas.microsoft.com/office/drawing/2016/5/9/chartex" xmlns:cx4="http://schemas.microsoft.com/office/drawing/2016/5/10/chartex" xmlns:cx5="http://schemas.microsoft.com/office/drawing/2016/5/11/chartex" xmlns:cx6="http://schemas.microsoft.com/office/drawing/2016/5/12/chartex" xmlns:cx7="http://schemas.microsoft.com/office/drawing/2016/5/13/chartex" xmlns:cx8="http://schemas.microsoft.com/office/drawing/2016/5/14/chartex" xmlns:mc="http://schemas.openxmlformats.org/markup-compatibility/2006" xmlns:aink="http://schemas.microsoft.com/office/drawing/2016/ink" xmlns:am3d="http://schemas.microsoft.com/office/drawing/2017/model3d" xmlns:o="urn:schemas-microsoft-com:office:office" xmlns:r="http://schemas.openxmlformats.org/officeDocument/2006/relationships" xmlns:m="http://schemas.openxmlformats.org/officeDocument/2006/math" xmlns:v="urn:schemas-microsoft-com:vml" xmlns:wp14="http://schemas.microsoft.com/office/word/2010/wordprocessingDrawing" xmlns:wp="http://schemas.openxmlformats.org/drawingml/2006/wordprocessingDrawing" xmlns:w10="urn:schemas-microsoft-com:office:word" xmlns:w="http://schemas.openxmlformats.org/wordprocessingml/2006/main" xmlns:w14="http://schemas.microsoft.com/office/word/2010/wordml" xmlns:w15="http://schemas.microsoft.com/office/word/2012/wordml" xmlns:w16cex="http://schemas.microsoft.com/office/word/2018/wordml/cex" xmlns:w16cid="http://schemas.microsoft.com/office/word/2016/wordml/cid" xmlns:w16="http://schemas.microsoft.com/office/word/2018/wordml" xmlns:w16sdtdh="http://schemas.microsoft.com/office/word/2020/wordml/sdtdatahash" xmlns:w16se="http://schemas.microsoft.com/office/word/2015/wordml/symex" xmlns:wpg="http://schemas.microsoft.com/office/word/2010/wordprocessingGroup" xmlns:wpi="http://schemas.microsoft.com/office/word/2010/wordprocessingInk" xmlns:wne="http://schemas.microsoft.com/office/word/2006/wordml" xmlns:wps="http://schemas.microsoft.com/office/word/2010/wordprocessingShape" mc:Ignorable="w14 w15 w16se w16cid w16 w16cex w16sdtdh wp14">
   <w:abstractNum w:abstractNumId="0" w15:restartNumberingAfterBreak="0">
     <w:nsid w:val="33A21838"/>
     <w:multiLevelType w:val="hybridMultilevel"/>
@@ -730,7 +1667,7 @@
 </file>
 
 <file path=word/styles.xml><?xml version="1.0" encoding="utf-8"?>
-<w:styles xmlns:mc="http://schemas.openxmlformats.org/markup-compatibility/2006" xmlns:r="http://schemas.openxmlformats.org/officeDocument/2006/relationships" xmlns:w="http://schemas.openxmlformats.org/wordprocessingml/2006/main" xmlns:w14="http://schemas.microsoft.com/office/word/2010/wordml" xmlns:w15="http://schemas.microsoft.com/office/word/2012/wordml" xmlns:w16cid="http://schemas.microsoft.com/office/word/2016/wordml/cid" xmlns:w16se="http://schemas.microsoft.com/office/word/2015/wordml/symex" mc:Ignorable="w14 w15 w16se w16cid">
+<w:styles xmlns:mc="http://schemas.openxmlformats.org/markup-compatibility/2006" xmlns:r="http://schemas.openxmlformats.org/officeDocument/2006/relationships" xmlns:w="http://schemas.openxmlformats.org/wordprocessingml/2006/main" xmlns:w14="http://schemas.microsoft.com/office/word/2010/wordml" xmlns:w15="http://schemas.microsoft.com/office/word/2012/wordml" xmlns:w16cex="http://schemas.microsoft.com/office/word/2018/wordml/cex" xmlns:w16cid="http://schemas.microsoft.com/office/word/2016/wordml/cid" xmlns:w16="http://schemas.microsoft.com/office/word/2018/wordml" xmlns:w16sdtdh="http://schemas.microsoft.com/office/word/2020/wordml/sdtdatahash" xmlns:w16se="http://schemas.microsoft.com/office/word/2015/wordml/symex" mc:Ignorable="w14 w15 w16se w16cid w16 w16cex w16sdtdh">
   <w:docDefaults>
     <w:rPrDefault>
       <w:rPr>
@@ -746,7 +1683,7 @@
       </w:pPr>
     </w:pPrDefault>
   </w:docDefaults>
-  <w:latentStyles w:defLockedState="0" w:defUIPriority="99" w:defSemiHidden="0" w:defUnhideWhenUsed="0" w:defQFormat="0" w:count="375">
+  <w:latentStyles w:defLockedState="0" w:defUIPriority="99" w:defSemiHidden="0" w:defUnhideWhenUsed="0" w:defQFormat="0" w:count="376">
     <w:lsdException w:name="Normal" w:uiPriority="0" w:qFormat="1"/>
     <w:lsdException w:name="heading 1" w:uiPriority="9" w:qFormat="1"/>
     <w:lsdException w:name="heading 2" w:semiHidden="1" w:uiPriority="9" w:unhideWhenUsed="1" w:qFormat="1"/>
@@ -852,7 +1789,6 @@
     <w:lsdException w:name="HTML Sample" w:semiHidden="1" w:unhideWhenUsed="1"/>
     <w:lsdException w:name="HTML Typewriter" w:semiHidden="1" w:unhideWhenUsed="1"/>
     <w:lsdException w:name="HTML Variable" w:semiHidden="1" w:unhideWhenUsed="1"/>
-    <w:lsdException w:name="Normal Table" w:semiHidden="1" w:unhideWhenUsed="1"/>
     <w:lsdException w:name="annotation subject" w:semiHidden="1" w:unhideWhenUsed="1"/>
     <w:lsdException w:name="No List" w:semiHidden="1" w:unhideWhenUsed="1"/>
     <w:lsdException w:name="Outline List 1" w:semiHidden="1" w:unhideWhenUsed="1"/>
@@ -899,10 +1835,8 @@
     <w:lsdException w:name="Table Subtle 2" w:semiHidden="1" w:unhideWhenUsed="1"/>
     <w:lsdException w:name="Table Web 1" w:semiHidden="1" w:unhideWhenUsed="1"/>
     <w:lsdException w:name="Table Web 2" w:semiHidden="1" w:unhideWhenUsed="1"/>
-    <w:lsdException w:name="Table Web 3" w:semiHidden="1" w:unhideWhenUsed="1"/>
     <w:lsdException w:name="Balloon Text" w:semiHidden="1" w:unhideWhenUsed="1"/>
     <w:lsdException w:name="Table Grid" w:uiPriority="39"/>
-    <w:lsdException w:name="Table Theme" w:semiHidden="1" w:unhideWhenUsed="1"/>
     <w:lsdException w:name="Placeholder Text" w:semiHidden="1"/>
     <w:lsdException w:name="No Spacing" w:uiPriority="1" w:qFormat="1"/>
     <w:lsdException w:name="Light Shading" w:uiPriority="60"/>
@@ -1122,6 +2056,7 @@
     <w:lsdException w:name="Smart Hyperlink" w:semiHidden="1" w:unhideWhenUsed="1"/>
     <w:lsdException w:name="Hashtag" w:semiHidden="1" w:unhideWhenUsed="1"/>
     <w:lsdException w:name="Unresolved Mention" w:semiHidden="1" w:unhideWhenUsed="1"/>
+    <w:lsdException w:name="Smart Link" w:semiHidden="1" w:unhideWhenUsed="1"/>
   </w:latentStyles>
   <w:style w:type="paragraph" w:default="1" w:styleId="Normal">
     <w:name w:val="Normal"/>

</xml_diff>